<commit_message>
Smartsheet README: run the demo from smartsheet_sasr/
The documented commands used ../_demo/ paths, which suggests running
them from macro_library/, where ss_run_demo.R fails ("cannot open the
connection") because it sources macro_library/ss_companion.R. The README
now says to run from smartsheet_sasr/ with _demo/ paths; run that way,
the R session output matches _demo/capture/r_session.txt line for line
(apart from a local "package built under R 4.6.1" warning). Word and PDF
exports regenerated.

Co-Authored-By: Claude Opus 5.5 <noreply@anthropic.com>
</commit_message>
<xml_diff>
--- a/smartsheet_sasr/macro_library/README.docx
+++ b/smartsheet_sasr/macro_library/README.docx
@@ -1201,7 +1201,33 @@
         <w:spacing w:after="120" w:line="270"/>
       </w:pPr>
       <w:r>
-        <w:t xml:space="preserve">allowlist guard actually happen:</w:t>
+        <w:t xml:space="preserve">allowlist guard actually happen. Run it from </w:t>
+      </w:r>
+      <w:r>
+        <w:rPr>
+          <w:rFonts w:ascii="Consolas" w:cs="Consolas" w:eastAsia="Consolas" w:hAnsi="Consolas"/>
+        </w:rPr>
+        <w:t xml:space="preserve">smartsheet_sasr/</w:t>
+      </w:r>
+      <w:r>
+        <w:t xml:space="preserve"> (the folder above this one), because</w:t>
+      </w:r>
+    </w:p>
+    <w:p>
+      <w:pPr>
+        <w:spacing w:after="120" w:line="270"/>
+      </w:pPr>
+      <w:r>
+        <w:t xml:space="preserve">the demo sources </w:t>
+      </w:r>
+      <w:r>
+        <w:rPr>
+          <w:rFonts w:ascii="Consolas" w:cs="Consolas" w:eastAsia="Consolas" w:hAnsi="Consolas"/>
+        </w:rPr>
+        <w:t xml:space="preserve">macro_library/ss_companion.R</w:t>
+      </w:r>
+      <w:r>
+        <w:t xml:space="preserve"> from there:</w:t>
       </w:r>
     </w:p>
     <w:p>
@@ -1217,15 +1243,23 @@
         <w:spacing w:after="120" w:line="270"/>
       </w:pPr>
       <w:r>
-        <w:t xml:space="preserve">node ../_demo/ss_mock_api.js &amp;                                   # representative Smartsheet API (localhost)</w:t>
-      </w:r>
-    </w:p>
-    <w:p>
-      <w:pPr>
-        <w:spacing w:after="120" w:line="270"/>
-      </w:pPr>
-      <w:r>
-        <w:t xml:space="preserve">SMARTSHEET_TOKEN=demo CP101_TRACKER_ID=5500 Rscript ../_demo/ss_run_demo.R</w:t>
+        <w:t xml:space="preserve">cd smartsheet_sasr</w:t>
+      </w:r>
+    </w:p>
+    <w:p>
+      <w:pPr>
+        <w:spacing w:after="120" w:line="270"/>
+      </w:pPr>
+      <w:r>
+        <w:t xml:space="preserve">node _demo/ss_mock_api.js &amp;                                      # representative Smartsheet API (localhost)</w:t>
+      </w:r>
+    </w:p>
+    <w:p>
+      <w:pPr>
+        <w:spacing w:after="120" w:line="270"/>
+      </w:pPr>
+      <w:r>
+        <w:t xml:space="preserve">SMARTSHEET_TOKEN=demo CP101_TRACKER_ID=5500 Rscript _demo/ss_run_demo.R</w:t>
       </w:r>
     </w:p>
     <w:p>

</xml_diff>